<commit_message>
Update CV files with corrected employment dates for Indigo AI and Shopswap; adjust job period format in portfolio and HTML files
</commit_message>
<xml_diff>
--- a/public/sahej-cv-ats.docx
+++ b/public/sahej-cv-ats.docx
@@ -130,7 +130,7 @@
         <w:t xml:space="preserve">Lead Frontend Engineer / Full Stack Engineer</w:t>
       </w:r>
       <w:r>
-        <w:t xml:space="preserve"> | Indigo AI | Remote | Oct 29, 2024 - Sep 2025</w:t>
+        <w:t xml:space="preserve"> | Indigo AI | Remote | Oct 2024 - Sep 2025</w:t>
       </w:r>
     </w:p>
     <w:p>
@@ -176,7 +176,7 @@
         <w:t xml:space="preserve">Lead Frontend Engineer / Full Stack Engineer</w:t>
       </w:r>
       <w:r>
-        <w:t xml:space="preserve"> | Shopswap | Remote | Aug 2022 - Oct 29, 2024</w:t>
+        <w:t xml:space="preserve"> | Shopswap | Remote | Aug 2022 - Oct 2024</w:t>
       </w:r>
     </w:p>
     <w:p>

</xml_diff>